<commit_message>
Updates for Checklist and Summary Doc
</commit_message>
<xml_diff>
--- a/EOS/EOS_Diagrams.docx
+++ b/EOS/EOS_Diagrams.docx
@@ -179,8 +179,6 @@
           <w:sz w:val="22"/>
         </w:rPr>
       </w:pPr>
-      <w:proofErr w:type="spellStart"/>
-      <w:proofErr w:type="gramStart"/>
       <w:r>
         <w:rPr>
           <w:b/>
@@ -197,71 +195,7 @@
           <w:iCs/>
           <w:sz w:val="22"/>
         </w:rPr>
-        <w:t>The</w:t>
-      </w:r>
-      <w:proofErr w:type="spellEnd"/>
-      <w:proofErr w:type="gramEnd"/>
-      <w:r>
-        <w:rPr>
-          <w:i/>
-          <w:iCs/>
-          <w:sz w:val="22"/>
-        </w:rPr>
-        <w:t xml:space="preserve"> diagram illustrates a </w:t>
-      </w:r>
-      <w:proofErr w:type="spellStart"/>
-      <w:r>
-        <w:rPr>
-          <w:i/>
-          <w:iCs/>
-          <w:sz w:val="22"/>
-        </w:rPr>
-        <w:t>livelock</w:t>
-      </w:r>
-      <w:proofErr w:type="spellEnd"/>
-      <w:r>
-        <w:rPr>
-          <w:i/>
-          <w:iCs/>
-          <w:sz w:val="22"/>
-        </w:rPr>
-        <w:t xml:space="preserve"> scenario in an operating system where two processes (Process A and Process B) are actively trying to perform an action (</w:t>
-      </w:r>
-      <w:proofErr w:type="gramStart"/>
-      <w:r>
-        <w:rPr>
-          <w:i/>
-          <w:iCs/>
-          <w:sz w:val="22"/>
-        </w:rPr>
-        <w:t>fork(</w:t>
-      </w:r>
-      <w:proofErr w:type="gramEnd"/>
-      <w:r>
-        <w:rPr>
-          <w:i/>
-          <w:iCs/>
-          <w:sz w:val="22"/>
-        </w:rPr>
-        <w:t>)</w:t>
-      </w:r>
-      <w:proofErr w:type="gramStart"/>
-      <w:r>
-        <w:rPr>
-          <w:i/>
-          <w:iCs/>
-          <w:sz w:val="22"/>
-        </w:rPr>
-        <w:t>), but</w:t>
-      </w:r>
-      <w:proofErr w:type="gramEnd"/>
-      <w:r>
-        <w:rPr>
-          <w:i/>
-          <w:iCs/>
-          <w:sz w:val="22"/>
-        </w:rPr>
-        <w:t xml:space="preserve"> repeatedly fail because the process table is full.</w:t>
+        <w:t>The diagram illustrates a livelock scenario in an operating system where two processes (Process A and Process B) are actively trying to perform an action (fork()), but repeatedly fail because the process table is full.</w:t>
       </w:r>
     </w:p>
     <w:p>
@@ -556,23 +490,13 @@
           <w:sz w:val="22"/>
         </w:rPr>
       </w:pPr>
-      <w:proofErr w:type="gramStart"/>
       <w:r>
         <w:rPr>
           <w:b/>
           <w:bCs/>
           <w:sz w:val="22"/>
         </w:rPr>
-        <w:t>a CPU</w:t>
-      </w:r>
-      <w:proofErr w:type="gramEnd"/>
-      <w:r>
-        <w:rPr>
-          <w:b/>
-          <w:bCs/>
-          <w:sz w:val="22"/>
-        </w:rPr>
-        <w:t xml:space="preserve"> burst is a period during which a process or program demands and actively utilizes the Central Processing Unit (CPU) for computation</w:t>
+        <w:t>a CPU burst is a period during which a process or program demands and actively utilizes the Central Processing Unit (CPU) for computation</w:t>
       </w:r>
       <w:r>
         <w:rPr>
@@ -625,6 +549,202 @@
                     <a:xfrm>
                       <a:off x="0" y="0"/>
                       <a:ext cx="3868173" cy="1968082"/>
+                    </a:xfrm>
+                    <a:prstGeom prst="rect">
+                      <a:avLst/>
+                    </a:prstGeom>
+                    <a:noFill/>
+                    <a:ln>
+                      <a:noFill/>
+                    </a:ln>
+                  </pic:spPr>
+                </pic:pic>
+              </a:graphicData>
+            </a:graphic>
+          </wp:inline>
+        </w:drawing>
+      </w:r>
+    </w:p>
+    <w:p>
+      <w:pPr>
+        <w:rPr>
+          <w:sz w:val="22"/>
+        </w:rPr>
+      </w:pPr>
+      <w:r>
+        <w:rPr>
+          <w:noProof/>
+        </w:rPr>
+        <w:lastRenderedPageBreak/>
+        <w:drawing>
+          <wp:inline distT="0" distB="0" distL="0" distR="0" wp14:anchorId="0C691B6A" wp14:editId="70C72EA9">
+            <wp:extent cx="3348567" cy="3348567"/>
+            <wp:effectExtent l="0" t="0" r="4445" b="4445"/>
+            <wp:docPr id="1827330943" name="Picture 3" descr="Anatomy of a System Call - The Coding Gopher"/>
+            <wp:cNvGraphicFramePr>
+              <a:graphicFrameLocks xmlns:a="http://schemas.openxmlformats.org/drawingml/2006/main" noChangeAspect="1"/>
+            </wp:cNvGraphicFramePr>
+            <a:graphic xmlns:a="http://schemas.openxmlformats.org/drawingml/2006/main">
+              <a:graphicData uri="http://schemas.openxmlformats.org/drawingml/2006/picture">
+                <pic:pic xmlns:pic="http://schemas.openxmlformats.org/drawingml/2006/picture">
+                  <pic:nvPicPr>
+                    <pic:cNvPr id="0" name="Picture 5" descr="Anatomy of a System Call - The Coding Gopher"/>
+                    <pic:cNvPicPr>
+                      <a:picLocks noChangeAspect="1" noChangeArrowheads="1"/>
+                    </pic:cNvPicPr>
+                  </pic:nvPicPr>
+                  <pic:blipFill>
+                    <a:blip r:embed="rId13">
+                      <a:extLst>
+                        <a:ext uri="{28A0092B-C50C-407E-A947-70E740481C1C}">
+                          <a14:useLocalDpi xmlns:a14="http://schemas.microsoft.com/office/drawing/2010/main" val="0"/>
+                        </a:ext>
+                      </a:extLst>
+                    </a:blip>
+                    <a:srcRect/>
+                    <a:stretch>
+                      <a:fillRect/>
+                    </a:stretch>
+                  </pic:blipFill>
+                  <pic:spPr bwMode="auto">
+                    <a:xfrm>
+                      <a:off x="0" y="0"/>
+                      <a:ext cx="3352197" cy="3352197"/>
+                    </a:xfrm>
+                    <a:prstGeom prst="rect">
+                      <a:avLst/>
+                    </a:prstGeom>
+                    <a:noFill/>
+                    <a:ln>
+                      <a:noFill/>
+                    </a:ln>
+                  </pic:spPr>
+                </pic:pic>
+              </a:graphicData>
+            </a:graphic>
+          </wp:inline>
+        </w:drawing>
+      </w:r>
+    </w:p>
+    <w:p>
+      <w:pPr>
+        <w:rPr>
+          <w:sz w:val="22"/>
+        </w:rPr>
+      </w:pPr>
+    </w:p>
+    <w:p>
+      <w:pPr>
+        <w:rPr>
+          <w:sz w:val="22"/>
+        </w:rPr>
+      </w:pPr>
+    </w:p>
+    <w:p>
+      <w:pPr>
+        <w:rPr>
+          <w:sz w:val="22"/>
+        </w:rPr>
+      </w:pPr>
+      <w:r>
+        <w:rPr>
+          <w:noProof/>
+        </w:rPr>
+        <w:drawing>
+          <wp:inline distT="0" distB="0" distL="0" distR="0" wp14:anchorId="7892FA37" wp14:editId="56BD8CF7">
+            <wp:extent cx="3818255" cy="4046855"/>
+            <wp:effectExtent l="0" t="0" r="0" b="0"/>
+            <wp:docPr id="1357560196" name="Picture 1" descr="Example of Standard C Library"/>
+            <wp:cNvGraphicFramePr>
+              <a:graphicFrameLocks xmlns:a="http://schemas.openxmlformats.org/drawingml/2006/main" noChangeAspect="1"/>
+            </wp:cNvGraphicFramePr>
+            <a:graphic xmlns:a="http://schemas.openxmlformats.org/drawingml/2006/main">
+              <a:graphicData uri="http://schemas.openxmlformats.org/drawingml/2006/picture">
+                <pic:pic xmlns:pic="http://schemas.openxmlformats.org/drawingml/2006/picture">
+                  <pic:nvPicPr>
+                    <pic:cNvPr id="0" name="Picture 1" descr="Example of Standard C Library"/>
+                    <pic:cNvPicPr>
+                      <a:picLocks noChangeAspect="1" noChangeArrowheads="1"/>
+                    </pic:cNvPicPr>
+                  </pic:nvPicPr>
+                  <pic:blipFill>
+                    <a:blip r:embed="rId14">
+                      <a:extLst>
+                        <a:ext uri="{28A0092B-C50C-407E-A947-70E740481C1C}">
+                          <a14:useLocalDpi xmlns:a14="http://schemas.microsoft.com/office/drawing/2010/main" val="0"/>
+                        </a:ext>
+                      </a:extLst>
+                    </a:blip>
+                    <a:srcRect/>
+                    <a:stretch>
+                      <a:fillRect/>
+                    </a:stretch>
+                  </pic:blipFill>
+                  <pic:spPr bwMode="auto">
+                    <a:xfrm>
+                      <a:off x="0" y="0"/>
+                      <a:ext cx="3818255" cy="4046855"/>
+                    </a:xfrm>
+                    <a:prstGeom prst="rect">
+                      <a:avLst/>
+                    </a:prstGeom>
+                    <a:noFill/>
+                    <a:ln>
+                      <a:noFill/>
+                    </a:ln>
+                  </pic:spPr>
+                </pic:pic>
+              </a:graphicData>
+            </a:graphic>
+          </wp:inline>
+        </w:drawing>
+      </w:r>
+    </w:p>
+    <w:p>
+      <w:pPr>
+        <w:rPr>
+          <w:sz w:val="22"/>
+        </w:rPr>
+      </w:pPr>
+      <w:r>
+        <w:rPr>
+          <w:noProof/>
+        </w:rPr>
+        <w:lastRenderedPageBreak/>
+        <w:drawing>
+          <wp:inline distT="0" distB="0" distL="0" distR="0" wp14:anchorId="43018AE4" wp14:editId="084B1CFA">
+            <wp:extent cx="5274310" cy="4892675"/>
+            <wp:effectExtent l="0" t="0" r="2540" b="3175"/>
+            <wp:docPr id="1811977887" name="Picture 2"/>
+            <wp:cNvGraphicFramePr>
+              <a:graphicFrameLocks xmlns:a="http://schemas.openxmlformats.org/drawingml/2006/main" noChangeAspect="1"/>
+            </wp:cNvGraphicFramePr>
+            <a:graphic xmlns:a="http://schemas.openxmlformats.org/drawingml/2006/main">
+              <a:graphicData uri="http://schemas.openxmlformats.org/drawingml/2006/picture">
+                <pic:pic xmlns:pic="http://schemas.openxmlformats.org/drawingml/2006/picture">
+                  <pic:nvPicPr>
+                    <pic:cNvPr id="0" name="Picture 3"/>
+                    <pic:cNvPicPr>
+                      <a:picLocks noChangeAspect="1" noChangeArrowheads="1"/>
+                    </pic:cNvPicPr>
+                  </pic:nvPicPr>
+                  <pic:blipFill>
+                    <a:blip r:embed="rId15">
+                      <a:extLst>
+                        <a:ext uri="{28A0092B-C50C-407E-A947-70E740481C1C}">
+                          <a14:useLocalDpi xmlns:a14="http://schemas.microsoft.com/office/drawing/2010/main" val="0"/>
+                        </a:ext>
+                      </a:extLst>
+                    </a:blip>
+                    <a:srcRect/>
+                    <a:stretch>
+                      <a:fillRect/>
+                    </a:stretch>
+                  </pic:blipFill>
+                  <pic:spPr bwMode="auto">
+                    <a:xfrm>
+                      <a:off x="0" y="0"/>
+                      <a:ext cx="5274310" cy="4892675"/>
                     </a:xfrm>
                     <a:prstGeom prst="rect">
                       <a:avLst/>
@@ -1292,6 +1412,7 @@
   <w:style w:type="character" w:default="1" w:styleId="DefaultParagraphFont">
     <w:name w:val="Default Paragraph Font"/>
     <w:uiPriority w:val="1"/>
+    <w:semiHidden/>
     <w:unhideWhenUsed/>
   </w:style>
   <w:style w:type="table" w:default="1" w:styleId="TableNormal">

</xml_diff>